<commit_message>
Correções no banco de dados e geração de DER
</commit_message>
<xml_diff>
--- a/Modelagens/ModelagemBD.docx
+++ b/Modelagens/ModelagemBD.docx
@@ -4,10 +4,7 @@
   <w:body>
     <w:p>
       <w:r>
-        <w:t>Quero modelar um sis</w:t>
-      </w:r>
-      <w:r>
-        <w:t xml:space="preserve">tema de divisão de despesas, </w:t>
+        <w:t xml:space="preserve">Quero modelar um sistema de divisão de despesas, </w:t>
       </w:r>
       <w:r>
         <w:t>chamado</w:t>
@@ -55,6 +52,111 @@
         <w:t>, para registrar quais pessoas fazem parte de cada grupo. Cada grupo poderá possuir várias despesas. Uma despesa representa um gasto compartilhado dentro de um grupo e deve estar associada a um ou mais pagamentos. Um pagamento registra o valor efetivamente pago e quem realizou esse pagamento. Como uma despesa pode ser paga por uma ou mais pessoas, os pagadores devem ser modelados separadamente, permitindo identificar quais participantes contribuíram para o pagamento e qual valor cada um pagou. Com essas informações, o sistema poderá calcular o saldo individual de cada participante dentro do grupo, comparando o quanto cada pessoa deveria pagar com o quanto ela efetivamente pagou. Ao final de um conjunto de despesas, o sistema deverá indicar quais membros possuem valores a receber e quais membros possuem valores a pagar.</w:t>
       </w:r>
     </w:p>
+    <w:p>
+      <w:r>
+        <w:rPr>
+          <w:noProof/>
+        </w:rPr>
+        <w:lastRenderedPageBreak/>
+        <w:drawing>
+          <wp:inline distT="0" distB="0" distL="0" distR="0" wp14:anchorId="22C62DAC" wp14:editId="65A9E2BC">
+            <wp:extent cx="5400040" cy="4050030"/>
+            <wp:effectExtent l="0" t="0" r="0" b="7620"/>
+            <wp:docPr id="1912830013" name="Imagem 1"/>
+            <wp:cNvGraphicFramePr>
+              <a:graphicFrameLocks xmlns:a="http://schemas.openxmlformats.org/drawingml/2006/main" noChangeAspect="1"/>
+            </wp:cNvGraphicFramePr>
+            <a:graphic xmlns:a="http://schemas.openxmlformats.org/drawingml/2006/main">
+              <a:graphicData uri="http://schemas.openxmlformats.org/drawingml/2006/picture">
+                <pic:pic xmlns:pic="http://schemas.openxmlformats.org/drawingml/2006/picture">
+                  <pic:nvPicPr>
+                    <pic:cNvPr id="1912830013" name="Imagem 1912830013"/>
+                    <pic:cNvPicPr/>
+                  </pic:nvPicPr>
+                  <pic:blipFill>
+                    <a:blip r:embed="rId4" cstate="print">
+                      <a:extLst>
+                        <a:ext uri="{28A0092B-C50C-407E-A947-70E740481C1C}">
+                          <a14:useLocalDpi xmlns:a14="http://schemas.microsoft.com/office/drawing/2010/main" val="0"/>
+                        </a:ext>
+                      </a:extLst>
+                    </a:blip>
+                    <a:stretch>
+                      <a:fillRect/>
+                    </a:stretch>
+                  </pic:blipFill>
+                  <pic:spPr>
+                    <a:xfrm>
+                      <a:off x="0" y="0"/>
+                      <a:ext cx="5400040" cy="4050030"/>
+                    </a:xfrm>
+                    <a:prstGeom prst="rect">
+                      <a:avLst/>
+                    </a:prstGeom>
+                  </pic:spPr>
+                </pic:pic>
+              </a:graphicData>
+            </a:graphic>
+          </wp:inline>
+        </w:drawing>
+      </w:r>
+    </w:p>
+    <w:p>
+      <w:r>
+        <w:br w:type="page"/>
+      </w:r>
+    </w:p>
+    <w:p/>
+    <w:p>
+      <w:r>
+        <w:rPr>
+          <w:noProof/>
+        </w:rPr>
+        <w:drawing>
+          <wp:inline distT="0" distB="0" distL="0" distR="0" wp14:anchorId="6026352C" wp14:editId="2E1E47C5">
+            <wp:extent cx="5400040" cy="3543935"/>
+            <wp:effectExtent l="0" t="0" r="0" b="0"/>
+            <wp:docPr id="844500297" name="Imagem 2"/>
+            <wp:cNvGraphicFramePr>
+              <a:graphicFrameLocks xmlns:a="http://schemas.openxmlformats.org/drawingml/2006/main" noChangeAspect="1"/>
+            </wp:cNvGraphicFramePr>
+            <a:graphic xmlns:a="http://schemas.openxmlformats.org/drawingml/2006/main">
+              <a:graphicData uri="http://schemas.openxmlformats.org/drawingml/2006/picture">
+                <pic:pic xmlns:pic="http://schemas.openxmlformats.org/drawingml/2006/picture">
+                  <pic:nvPicPr>
+                    <pic:cNvPr id="844500297" name="Imagem 844500297"/>
+                    <pic:cNvPicPr/>
+                  </pic:nvPicPr>
+                  <pic:blipFill>
+                    <a:blip r:embed="rId5" cstate="print">
+                      <a:extLst>
+                        <a:ext uri="{28A0092B-C50C-407E-A947-70E740481C1C}">
+                          <a14:useLocalDpi xmlns:a14="http://schemas.microsoft.com/office/drawing/2010/main" val="0"/>
+                        </a:ext>
+                      </a:extLst>
+                    </a:blip>
+                    <a:stretch>
+                      <a:fillRect/>
+                    </a:stretch>
+                  </pic:blipFill>
+                  <pic:spPr>
+                    <a:xfrm>
+                      <a:off x="0" y="0"/>
+                      <a:ext cx="5400040" cy="3543935"/>
+                    </a:xfrm>
+                    <a:prstGeom prst="rect">
+                      <a:avLst/>
+                    </a:prstGeom>
+                  </pic:spPr>
+                </pic:pic>
+              </a:graphicData>
+            </a:graphic>
+          </wp:inline>
+        </w:drawing>
+      </w:r>
+    </w:p>
+    <w:p/>
+    <w:p/>
     <w:sectPr>
       <w:pgSz w:w="11906" w:h="16838"/>
       <w:pgMar w:top="1417" w:right="1701" w:bottom="1417" w:left="1701" w:header="708" w:footer="708" w:gutter="0"/>

</xml_diff>